<commit_message>
Roteiro Rick: correções factuais na parte 3
Co-Authored-By: Claude Opus 5.5 <noreply@anthropic.com>
Claude-Session: https://claude.ai/code/session_01MJjUEEZrxQDEUifKK2vj9g
</commit_message>
<xml_diff>
--- a/roteiros/rick/Rick_Parte3.docx
+++ b/roteiros/rick/Rick_Parte3.docx
@@ -103,7 +103,7 @@
         <w:rPr>
           <w:color w:val="000000"/>
         </w:rPr>
-        <w:t>"Helicóptero desaparece na serra com o cantor Rick, da dupla com Renner."</w:t>
+        <w:t>Um helicóptero com o cantor Rick, da dupla com Renner, tinha desaparecido na serra catarinense.</w:t>
       </w:r>
     </w:p>
     <w:p>
@@ -247,7 +247,7 @@
         <w:rPr>
           <w:color w:val="000000"/>
         </w:rPr>
-        <w:t>E, por volta do meio-dia, quase vinte horas depois do desaparecimento, veio a notícia que ninguém queria ouvir.</w:t>
+        <w:t>E, por volta do meio-dia, depois de quase vinte horas de buscas, veio a notícia que ninguém queria ouvir.</w:t>
       </w:r>
     </w:p>
     <w:p>

</xml_diff>